<commit_message>
VSL: regenera docx com o preço R$39,90
</commit_message>
<xml_diff>
--- a/VSL-Plano-Capilar-Juliane.docx
+++ b/VSL-Plano-Capilar-Juliane.docx
@@ -44,7 +44,7 @@
           <w:sz w:val="19"/>
           <w:szCs w:val="19"/>
         </w:rPr>
-        <w:t xml:space="preserve">Oferta: Plano Capilar Personalizado — R$47 (à vista/PIX ou 3x no cartão). Garantia 7 dias. Acesso ao app na hora.</w:t>
+        <w:t xml:space="preserve">Oferta: Plano Capilar Personalizado — R$39,90 (à vista/PIX ou 3x no cartão). Garantia 7 dias. Acesso ao app na hora.</w:t>
       </w:r>
     </w:p>
     <w:p>
@@ -3591,19 +3591,19 @@
           <w:b w:val="false"/>
           <w:bCs w:val="false"/>
         </w:rPr>
-        <w:t xml:space="preserve">Na verdade, pra ter acesso ao Plano Capilar Personalizado, com a minha análise das suas fotos e o cronograma completo dos noventa dias, você vai precisar fazer um investimento simbólico de apenas quarenta e sete reais.</w:t>
-      </w:r>
-    </w:p>
-    <w:p>
-      <w:pPr>
-        <w:spacing w:after="140" w:line="300"/>
-      </w:pPr>
-      <w:r>
-        <w:rPr>
-          <w:b w:val="false"/>
-          <w:bCs w:val="false"/>
-        </w:rPr>
-        <w:t xml:space="preserve">Isso mesmo, eu não tô brincando, quarenta e sete reais, menos que uma única máscara boa de salão e menos do que o seu iFood de um domingo.</w:t>
+        <w:t xml:space="preserve">Na verdade, pra ter acesso ao Plano Capilar Personalizado, com a minha análise das suas fotos e o cronograma completo dos noventa dias, você vai precisar fazer um investimento simbólico de apenas trinta e nove e noventa.</w:t>
+      </w:r>
+    </w:p>
+    <w:p>
+      <w:pPr>
+        <w:spacing w:after="140" w:line="300"/>
+      </w:pPr>
+      <w:r>
+        <w:rPr>
+          <w:b w:val="false"/>
+          <w:bCs w:val="false"/>
+        </w:rPr>
+        <w:t xml:space="preserve">Isso mesmo, eu não tô brincando, trinta e nove e noventa, menos que uma única máscara boa de salão e menos do que o seu iFood de um domingo.</w:t>
       </w:r>
     </w:p>
     <w:p>
@@ -4309,7 +4309,7 @@
           <w:b w:val="false"/>
           <w:bCs w:val="false"/>
         </w:rPr>
-        <w:t xml:space="preserve">Mas como eu te prometi e eu tenho palavra, só hoje você vai estar investindo apenas quarenta e sete reais no Pix ou parcelado no cartão.</w:t>
+        <w:t xml:space="preserve">Mas como eu te prometi e eu tenho palavra, só hoje você vai estar investindo apenas trinta e nove e noventa no Pix ou parcelado no cartão.</w:t>
       </w:r>
     </w:p>
     <w:p>

</xml_diff>